<commit_message>
Integrate dataset into dashboard: UNSW-NB15 replay panel
- ml/export_replay.py: trained XGBoost classifies the real held-out test flows;
  writes data/unsw-replay.json (raw features + family + actual/predicted/proba)
- components/idps/unsw-replay-panel.tsx: streams those genuine flows one at a
  time, showing each verdict vs ground truth with live-recomputed accuracy/
  precision/recall/FPR converging to the offline benchmark
- fix: moved confusion-matrix tallies out of the setCursor updater so React
  StrictMode double-invocation cannot double-count
- docs: REPORT.md 3.2.3 integration section, master report v2, DEMO-GUIDE and
  READMEs updated for the replay flow

Co-Authored-By: Claude Fable 5 <noreply@anthropic.com>
</commit_message>
<xml_diff>
--- a/docs/Assignment2-Report-UPDATED.docx
+++ b/docs/Assignment2-Report-UPDATED.docx
@@ -4936,7 +4936,33 @@
           <w:b w:val="0"/>
           <w:i w:val="0"/>
         </w:rPr>
-        <w:t>3.2.3 Live-simulation results (hybrid engine)</w:t>
+        <w:t>3.2.3 Integration: the dataset driving the dashboard</w:t>
+      </w:r>
+    </w:p>
+    <w:p>
+      <w:pPr>
+        <w:spacing w:line="360" w:lineRule="auto" w:after="120"/>
+      </w:pPr>
+      <w:r>
+        <w:rPr>
+          <w:b/>
+        </w:rPr>
+        <w:t>The trained model classifies real test flows inside the dashboard.</w:t>
+      </w:r>
+      <w:r>
+        <w:t xml:space="preserve"> To connect the benchmark and the live demonstration, the trained XGBoost model classifies the genuine held-out UNSW-NB15 test flows offline (ml/export_replay.py), and the dashboard's UNSW-NB15 Replay panel streams those real flows one at a time. Each row shows the flow's true attack family against the model's ATTACK/BENIGN verdict and its predicted attack probability; the accuracy, precision, recall and false-positive-rate tiles recompute live and converge to the offline benchmark (~92.02% accuracy, ~11.13% FPR) as flows accumulate. This makes the reported figures demonstrably the output of the trained model classifying real data rather than a static number. (A scikit-learn model cannot execute inside a browser, so inference runs in Python and the per-flow verdicts are replayed; the separate hybrid engine below classifies the synthetic stream in real time - two models presented in one dashboard.)</w:t>
+      </w:r>
+    </w:p>
+    <w:p>
+      <w:pPr>
+        <w:pStyle w:val="Heading4"/>
+      </w:pPr>
+      <w:r>
+        <w:rPr>
+          <w:b w:val="0"/>
+          <w:i w:val="0"/>
+        </w:rPr>
+        <w:t>3.2.4 Live-simulation results (hybrid engine)</w:t>
       </w:r>
     </w:p>
     <w:p>

</xml_diff>